<commit_message>
updated based on court feedback
</commit_message>
<xml_diff>
--- a/docassemble/AppealsEntryForm/data/templates/appeals_entry_form.docx
+++ b/docassemble/AppealsEntryForm/data/templates/appeals_entry_form.docx
@@ -281,7 +281,21 @@
         <w:rPr>
           <w:rFonts w:ascii="Times New Roman" w:hAnsi="Times New Roman" w:cs="Times New Roman"/>
         </w:rPr>
-        <w:t>For each appellant or cross-appellant, a separate form must be completed in its entirety and submitted through eFileMA.com.</w:t>
+        <w:t xml:space="preserve">For each appellant or cross-appellant, a separate form must be completed in its entirety and </w:t>
+      </w:r>
+      <w:proofErr w:type="gramStart"/>
+      <w:r>
+        <w:rPr>
+          <w:rFonts w:ascii="Times New Roman" w:hAnsi="Times New Roman" w:cs="Times New Roman"/>
+        </w:rPr>
+        <w:t>submitted</w:t>
+      </w:r>
+      <w:proofErr w:type="gramEnd"/>
+      <w:r>
+        <w:rPr>
+          <w:rFonts w:ascii="Times New Roman" w:hAnsi="Times New Roman" w:cs="Times New Roman"/>
+        </w:rPr>
+        <w:t xml:space="preserve"> through eFileMA.com.</w:t>
       </w:r>
     </w:p>
     <w:p>
@@ -299,7 +313,21 @@
         <w:rPr>
           <w:rFonts w:ascii="Times New Roman" w:hAnsi="Times New Roman" w:cs="Times New Roman"/>
         </w:rPr>
-        <w:t>The completed form and any necessary fee or motion to waive the fee must be received within 14 days of your receipt of the notice of assembly from the clerk of the lower court. See Mass. R. A. P. 10(a)(1).</w:t>
+        <w:t xml:space="preserve">The completed form and any necessary fee or motion to waive the fee must </w:t>
+      </w:r>
+      <w:proofErr w:type="gramStart"/>
+      <w:r>
+        <w:rPr>
+          <w:rFonts w:ascii="Times New Roman" w:hAnsi="Times New Roman" w:cs="Times New Roman"/>
+        </w:rPr>
+        <w:t>be received</w:t>
+      </w:r>
+      <w:proofErr w:type="gramEnd"/>
+      <w:r>
+        <w:rPr>
+          <w:rFonts w:ascii="Times New Roman" w:hAnsi="Times New Roman" w:cs="Times New Roman"/>
+        </w:rPr>
+        <w:t xml:space="preserve"> within 14 days of your receipt of the notice of assembly from the clerk of the lower court. See Mass. R. A. P. 10(a)(1).</w:t>
       </w:r>
     </w:p>
     <w:p>
@@ -350,7 +378,21 @@
         <w:rPr>
           <w:rFonts w:ascii="Times New Roman" w:hAnsi="Times New Roman" w:cs="Times New Roman"/>
         </w:rPr>
-        <w:t>{{case_name}}</w:t>
+        <w:t>{{</w:t>
+      </w:r>
+      <w:proofErr w:type="spellStart"/>
+      <w:r>
+        <w:rPr>
+          <w:rFonts w:ascii="Times New Roman" w:hAnsi="Times New Roman" w:cs="Times New Roman"/>
+        </w:rPr>
+        <w:t>case_name</w:t>
+      </w:r>
+      <w:proofErr w:type="spellEnd"/>
+      <w:r>
+        <w:rPr>
+          <w:rFonts w:ascii="Times New Roman" w:hAnsi="Times New Roman" w:cs="Times New Roman"/>
+        </w:rPr>
+        <w:t>}}</w:t>
       </w:r>
     </w:p>
     <w:p>
@@ -369,7 +411,21 @@
         <w:rPr>
           <w:rFonts w:ascii="Times New Roman" w:hAnsi="Times New Roman" w:cs="Times New Roman"/>
         </w:rPr>
-        <w:t>{{ trial_court }}</w:t>
+        <w:t xml:space="preserve">{{ </w:t>
+      </w:r>
+      <w:proofErr w:type="spellStart"/>
+      <w:r>
+        <w:rPr>
+          <w:rFonts w:ascii="Times New Roman" w:hAnsi="Times New Roman" w:cs="Times New Roman"/>
+        </w:rPr>
+        <w:t>trial_court</w:t>
+      </w:r>
+      <w:proofErr w:type="spellEnd"/>
+      <w:r>
+        <w:rPr>
+          <w:rFonts w:ascii="Times New Roman" w:hAnsi="Times New Roman" w:cs="Times New Roman"/>
+        </w:rPr>
+        <w:t xml:space="preserve"> }}</w:t>
       </w:r>
       <w:r>
         <w:rPr>
@@ -402,57 +458,149 @@
         </w:rPr>
         <w:t xml:space="preserve">Docket Number: </w:t>
       </w:r>
-      <w:r>
-        <w:rPr>
-          <w:rFonts w:ascii="Times New Roman" w:hAnsi="Times New Roman" w:cs="Times New Roman"/>
-        </w:rPr>
-        <w:t>{{ docket_num }}</w:t>
-      </w:r>
-    </w:p>
-    <w:p>
-      <w:pPr>
-        <w:rPr>
-          <w:rFonts w:ascii="Times New Roman" w:hAnsi="Times New Roman" w:cs="Times New Roman"/>
-        </w:rPr>
-      </w:pPr>
-    </w:p>
-    <w:p>
-      <w:pPr>
-        <w:rPr>
-          <w:rFonts w:ascii="Times New Roman" w:hAnsi="Times New Roman" w:cs="Times New Roman"/>
-        </w:rPr>
-      </w:pPr>
-      <w:r>
-        <w:rPr>
-          <w:rFonts w:ascii="Times New Roman" w:hAnsi="Times New Roman" w:cs="Times New Roman"/>
-        </w:rPr>
-        <w:t>{% if filer_role == 'attorney' %}</w:t>
-      </w:r>
-    </w:p>
-    <w:p>
-      <w:pPr>
-        <w:rPr>
-          <w:rFonts w:ascii="Times New Roman" w:hAnsi="Times New Roman" w:cs="Times New Roman"/>
-        </w:rPr>
-      </w:pPr>
-      <w:r>
-        <w:rPr>
-          <w:rFonts w:ascii="Times New Roman" w:hAnsi="Times New Roman" w:cs="Times New Roman"/>
-        </w:rPr>
-        <w:t>I, {{ users[0].name.full() }}, am entering this appeal pursuant to Mass. R. A. P. 10(a)(1)</w:t>
-      </w:r>
-    </w:p>
-    <w:p>
-      <w:pPr>
-        <w:rPr>
-          <w:rFonts w:ascii="Times New Roman" w:hAnsi="Times New Roman" w:cs="Times New Roman"/>
-        </w:rPr>
-      </w:pPr>
-      <w:r>
-        <w:rPr>
-          <w:rFonts w:ascii="Times New Roman" w:hAnsi="Times New Roman" w:cs="Times New Roman"/>
-        </w:rPr>
-        <w:t>on behalf of {{ appellant_name }}, by:</w:t>
+      <w:proofErr w:type="gramStart"/>
+      <w:r>
+        <w:rPr>
+          <w:rFonts w:ascii="Times New Roman" w:hAnsi="Times New Roman" w:cs="Times New Roman"/>
+        </w:rPr>
+        <w:t xml:space="preserve">{{ </w:t>
+      </w:r>
+      <w:proofErr w:type="spellStart"/>
+      <w:r>
+        <w:rPr>
+          <w:rFonts w:ascii="Times New Roman" w:hAnsi="Times New Roman" w:cs="Times New Roman"/>
+        </w:rPr>
+        <w:t>docket</w:t>
+      </w:r>
+      <w:proofErr w:type="gramEnd"/>
+      <w:r>
+        <w:rPr>
+          <w:rFonts w:ascii="Times New Roman" w:hAnsi="Times New Roman" w:cs="Times New Roman"/>
+        </w:rPr>
+        <w:t>_num</w:t>
+      </w:r>
+      <w:proofErr w:type="spellEnd"/>
+      <w:r>
+        <w:rPr>
+          <w:rFonts w:ascii="Times New Roman" w:hAnsi="Times New Roman" w:cs="Times New Roman"/>
+        </w:rPr>
+        <w:t xml:space="preserve"> }}</w:t>
+      </w:r>
+    </w:p>
+    <w:p>
+      <w:pPr>
+        <w:rPr>
+          <w:rFonts w:ascii="Times New Roman" w:hAnsi="Times New Roman" w:cs="Times New Roman"/>
+        </w:rPr>
+      </w:pPr>
+    </w:p>
+    <w:p>
+      <w:pPr>
+        <w:rPr>
+          <w:rFonts w:ascii="Times New Roman" w:hAnsi="Times New Roman" w:cs="Times New Roman"/>
+        </w:rPr>
+      </w:pPr>
+      <w:r>
+        <w:rPr>
+          <w:rFonts w:ascii="Times New Roman" w:hAnsi="Times New Roman" w:cs="Times New Roman"/>
+        </w:rPr>
+        <w:t xml:space="preserve">{% if </w:t>
+      </w:r>
+      <w:proofErr w:type="spellStart"/>
+      <w:r>
+        <w:rPr>
+          <w:rFonts w:ascii="Times New Roman" w:hAnsi="Times New Roman" w:cs="Times New Roman"/>
+        </w:rPr>
+        <w:t>filer_role</w:t>
+      </w:r>
+      <w:proofErr w:type="spellEnd"/>
+      <w:r>
+        <w:rPr>
+          <w:rFonts w:ascii="Times New Roman" w:hAnsi="Times New Roman" w:cs="Times New Roman"/>
+        </w:rPr>
+        <w:t xml:space="preserve"> == 'attorney' %}</w:t>
+      </w:r>
+    </w:p>
+    <w:p>
+      <w:pPr>
+        <w:rPr>
+          <w:rFonts w:ascii="Times New Roman" w:hAnsi="Times New Roman" w:cs="Times New Roman"/>
+        </w:rPr>
+      </w:pPr>
+      <w:r>
+        <w:rPr>
+          <w:rFonts w:ascii="Times New Roman" w:hAnsi="Times New Roman" w:cs="Times New Roman"/>
+        </w:rPr>
+        <w:t xml:space="preserve">I, </w:t>
+      </w:r>
+      <w:proofErr w:type="gramStart"/>
+      <w:r>
+        <w:rPr>
+          <w:rFonts w:ascii="Times New Roman" w:hAnsi="Times New Roman" w:cs="Times New Roman"/>
+        </w:rPr>
+        <w:t>{{ users</w:t>
+      </w:r>
+      <w:proofErr w:type="gramEnd"/>
+      <w:r>
+        <w:rPr>
+          <w:rFonts w:ascii="Times New Roman" w:hAnsi="Times New Roman" w:cs="Times New Roman"/>
+        </w:rPr>
+        <w:t>[0].</w:t>
+      </w:r>
+      <w:proofErr w:type="spellStart"/>
+      <w:r>
+        <w:rPr>
+          <w:rFonts w:ascii="Times New Roman" w:hAnsi="Times New Roman" w:cs="Times New Roman"/>
+        </w:rPr>
+        <w:t>name.full</w:t>
+      </w:r>
+      <w:proofErr w:type="spellEnd"/>
+      <w:r>
+        <w:rPr>
+          <w:rFonts w:ascii="Times New Roman" w:hAnsi="Times New Roman" w:cs="Times New Roman"/>
+        </w:rPr>
+        <w:t>() }}, am entering this appeal pursuant to Mass. R. A. P. 10(a)(1)</w:t>
+      </w:r>
+    </w:p>
+    <w:p>
+      <w:pPr>
+        <w:rPr>
+          <w:rFonts w:ascii="Times New Roman" w:hAnsi="Times New Roman" w:cs="Times New Roman"/>
+        </w:rPr>
+      </w:pPr>
+      <w:r>
+        <w:rPr>
+          <w:rFonts w:ascii="Times New Roman" w:hAnsi="Times New Roman" w:cs="Times New Roman"/>
+        </w:rPr>
+        <w:t xml:space="preserve">on behalf of </w:t>
+      </w:r>
+      <w:proofErr w:type="gramStart"/>
+      <w:r>
+        <w:rPr>
+          <w:rFonts w:ascii="Times New Roman" w:hAnsi="Times New Roman" w:cs="Times New Roman"/>
+        </w:rPr>
+        <w:t xml:space="preserve">{{ </w:t>
+      </w:r>
+      <w:proofErr w:type="spellStart"/>
+      <w:r>
+        <w:rPr>
+          <w:rFonts w:ascii="Times New Roman" w:hAnsi="Times New Roman" w:cs="Times New Roman"/>
+        </w:rPr>
+        <w:t>appellant</w:t>
+      </w:r>
+      <w:proofErr w:type="gramEnd"/>
+      <w:r>
+        <w:rPr>
+          <w:rFonts w:ascii="Times New Roman" w:hAnsi="Times New Roman" w:cs="Times New Roman"/>
+        </w:rPr>
+        <w:t>_name</w:t>
+      </w:r>
+      <w:proofErr w:type="spellEnd"/>
+      <w:r>
+        <w:rPr>
+          <w:rFonts w:ascii="Times New Roman" w:hAnsi="Times New Roman" w:cs="Times New Roman"/>
+        </w:rPr>
+        <w:t xml:space="preserve"> }}, by:</w:t>
       </w:r>
     </w:p>
     <w:p>
@@ -478,20 +626,76 @@
         <w:rPr>
           <w:rFonts w:ascii="Times New Roman" w:hAnsi="Times New Roman" w:cs="Times New Roman"/>
         </w:rPr>
-        <w:t>I, {{ appellant_name }}, am entering this appeal pursuant to Mass. R. A. P. 10(a)(1)</w:t>
-      </w:r>
-    </w:p>
-    <w:p>
-      <w:pPr>
-        <w:rPr>
-          <w:rFonts w:ascii="Times New Roman" w:hAnsi="Times New Roman" w:cs="Times New Roman"/>
-        </w:rPr>
-      </w:pPr>
-      <w:r>
-        <w:rPr>
-          <w:rFonts w:ascii="Times New Roman" w:hAnsi="Times New Roman" w:cs="Times New Roman"/>
-        </w:rPr>
-        <w:t>on behalf of {{ appellant_name }}, by:</w:t>
+        <w:t xml:space="preserve">I, </w:t>
+      </w:r>
+      <w:proofErr w:type="gramStart"/>
+      <w:r>
+        <w:rPr>
+          <w:rFonts w:ascii="Times New Roman" w:hAnsi="Times New Roman" w:cs="Times New Roman"/>
+        </w:rPr>
+        <w:t xml:space="preserve">{{ </w:t>
+      </w:r>
+      <w:proofErr w:type="spellStart"/>
+      <w:r>
+        <w:rPr>
+          <w:rFonts w:ascii="Times New Roman" w:hAnsi="Times New Roman" w:cs="Times New Roman"/>
+        </w:rPr>
+        <w:t>appellant</w:t>
+      </w:r>
+      <w:proofErr w:type="gramEnd"/>
+      <w:r>
+        <w:rPr>
+          <w:rFonts w:ascii="Times New Roman" w:hAnsi="Times New Roman" w:cs="Times New Roman"/>
+        </w:rPr>
+        <w:t>_name</w:t>
+      </w:r>
+      <w:proofErr w:type="spellEnd"/>
+      <w:r>
+        <w:rPr>
+          <w:rFonts w:ascii="Times New Roman" w:hAnsi="Times New Roman" w:cs="Times New Roman"/>
+        </w:rPr>
+        <w:t xml:space="preserve"> }}, am entering this appeal pursuant to Mass. R. A. P. 10(a)(1)</w:t>
+      </w:r>
+    </w:p>
+    <w:p>
+      <w:pPr>
+        <w:rPr>
+          <w:rFonts w:ascii="Times New Roman" w:hAnsi="Times New Roman" w:cs="Times New Roman"/>
+        </w:rPr>
+      </w:pPr>
+      <w:r>
+        <w:rPr>
+          <w:rFonts w:ascii="Times New Roman" w:hAnsi="Times New Roman" w:cs="Times New Roman"/>
+        </w:rPr>
+        <w:t xml:space="preserve">on behalf of </w:t>
+      </w:r>
+      <w:proofErr w:type="gramStart"/>
+      <w:r>
+        <w:rPr>
+          <w:rFonts w:ascii="Times New Roman" w:hAnsi="Times New Roman" w:cs="Times New Roman"/>
+        </w:rPr>
+        <w:t xml:space="preserve">{{ </w:t>
+      </w:r>
+      <w:proofErr w:type="spellStart"/>
+      <w:r>
+        <w:rPr>
+          <w:rFonts w:ascii="Times New Roman" w:hAnsi="Times New Roman" w:cs="Times New Roman"/>
+        </w:rPr>
+        <w:t>appellant</w:t>
+      </w:r>
+      <w:proofErr w:type="gramEnd"/>
+      <w:r>
+        <w:rPr>
+          <w:rFonts w:ascii="Times New Roman" w:hAnsi="Times New Roman" w:cs="Times New Roman"/>
+        </w:rPr>
+        <w:t>_name</w:t>
+      </w:r>
+      <w:proofErr w:type="spellEnd"/>
+      <w:r>
+        <w:rPr>
+          <w:rFonts w:ascii="Times New Roman" w:hAnsi="Times New Roman" w:cs="Times New Roman"/>
+        </w:rPr>
+        <w:t xml:space="preserve"> }}, by:</w:t>
       </w:r>
     </w:p>
     <w:p>
@@ -529,7 +733,41 @@
         <w:rPr>
           <w:rFonts w:ascii="Times New Roman" w:hAnsi="Times New Roman" w:cs="Times New Roman"/>
         </w:rPr>
-        <w:t>{% if paying_fee  %}</w:t>
+        <w:t xml:space="preserve">{% if </w:t>
+      </w:r>
+      <w:proofErr w:type="spellStart"/>
+      <w:r>
+        <w:rPr>
+          <w:rFonts w:ascii="Times New Roman" w:hAnsi="Times New Roman" w:cs="Times New Roman"/>
+        </w:rPr>
+        <w:t>filing_fee_option</w:t>
+      </w:r>
+      <w:proofErr w:type="spellEnd"/>
+      <w:r>
+        <w:rPr>
+          <w:rFonts w:ascii="Times New Roman" w:hAnsi="Times New Roman" w:cs="Times New Roman"/>
+        </w:rPr>
+        <w:t xml:space="preserve"> =</w:t>
+      </w:r>
+      <w:proofErr w:type="gramStart"/>
+      <w:r>
+        <w:rPr>
+          <w:rFonts w:ascii="Times New Roman" w:hAnsi="Times New Roman" w:cs="Times New Roman"/>
+        </w:rPr>
+        <w:t>=  ‘</w:t>
+      </w:r>
+      <w:proofErr w:type="gramEnd"/>
+      <w:r>
+        <w:rPr>
+          <w:rFonts w:ascii="Times New Roman" w:hAnsi="Times New Roman" w:cs="Times New Roman"/>
+        </w:rPr>
+        <w:t xml:space="preserve">pay’ </w:t>
+      </w:r>
+      <w:r>
+        <w:rPr>
+          <w:rFonts w:ascii="Times New Roman" w:hAnsi="Times New Roman" w:cs="Times New Roman"/>
+        </w:rPr>
+        <w:t>%}</w:t>
       </w:r>
       <w:r>
         <w:rPr>
@@ -599,17 +837,39 @@
         </w:rPr>
         <w:t xml:space="preserve">{% if </w:t>
       </w:r>
-      <w:r>
-        <w:rPr>
-          <w:rFonts w:ascii="Times New Roman" w:hAnsi="Times New Roman" w:cs="Times New Roman"/>
-        </w:rPr>
-        <w:t>fee_waiver_requested</w:t>
-      </w:r>
-      <w:r>
-        <w:rPr>
-          <w:rFonts w:ascii="Times New Roman" w:hAnsi="Times New Roman" w:cs="Times New Roman"/>
-        </w:rPr>
-        <w:t xml:space="preserve">  %}</w:t>
+      <w:proofErr w:type="spellStart"/>
+      <w:r>
+        <w:rPr>
+          <w:rFonts w:ascii="Times New Roman" w:hAnsi="Times New Roman" w:cs="Times New Roman"/>
+        </w:rPr>
+        <w:t>filing_fee_option</w:t>
+      </w:r>
+      <w:proofErr w:type="spellEnd"/>
+      <w:r>
+        <w:rPr>
+          <w:rFonts w:ascii="Times New Roman" w:hAnsi="Times New Roman" w:cs="Times New Roman"/>
+        </w:rPr>
+        <w:t xml:space="preserve"> =</w:t>
+      </w:r>
+      <w:proofErr w:type="gramStart"/>
+      <w:r>
+        <w:rPr>
+          <w:rFonts w:ascii="Times New Roman" w:hAnsi="Times New Roman" w:cs="Times New Roman"/>
+        </w:rPr>
+        <w:t>=  ‘</w:t>
+      </w:r>
+      <w:proofErr w:type="gramEnd"/>
+      <w:r>
+        <w:rPr>
+          <w:rFonts w:ascii="Times New Roman" w:hAnsi="Times New Roman" w:cs="Times New Roman"/>
+        </w:rPr>
+        <w:t xml:space="preserve">waiver’ </w:t>
+      </w:r>
+      <w:r>
+        <w:rPr>
+          <w:rFonts w:ascii="Times New Roman" w:hAnsi="Times New Roman" w:cs="Times New Roman"/>
+        </w:rPr>
+        <w:t>%}</w:t>
       </w:r>
       <w:r>
         <w:rPr>
@@ -691,6 +951,7 @@
         </w:rPr>
         <w:t xml:space="preserve">{% if </w:t>
       </w:r>
+      <w:proofErr w:type="spellStart"/>
       <w:r>
         <w:rPr>
           <w:rFonts w:ascii="Times New Roman" w:hAnsi="Times New Roman" w:cs="Times New Roman"/>
@@ -698,6 +959,7 @@
         </w:rPr>
         <w:t>appellant_is_commonwealth</w:t>
       </w:r>
+      <w:proofErr w:type="spellEnd"/>
       <w:r>
         <w:rPr>
           <w:rFonts w:ascii="Times New Roman" w:hAnsi="Times New Roman" w:cs="Times New Roman"/>
@@ -784,20 +1046,50 @@
         <w:rPr>
           <w:rFonts w:ascii="Times New Roman" w:hAnsi="Times New Roman" w:cs="Times New Roman"/>
         </w:rPr>
-        <w:t>I further certify under the penalty of perjury that the notice of assembly was received on</w:t>
-      </w:r>
-    </w:p>
-    <w:p>
-      <w:pPr>
-        <w:rPr>
-          <w:rFonts w:ascii="Times New Roman" w:hAnsi="Times New Roman" w:cs="Times New Roman"/>
-        </w:rPr>
-      </w:pPr>
-      <w:r>
-        <w:rPr>
-          <w:rFonts w:ascii="Times New Roman" w:hAnsi="Times New Roman" w:cs="Times New Roman"/>
-        </w:rPr>
-        <w:t>{{ notice_of_assembly_received_date }}</w:t>
+        <w:t xml:space="preserve">I further certify under the penalty of perjury that the notice of assembly was received </w:t>
+      </w:r>
+      <w:proofErr w:type="gramStart"/>
+      <w:r>
+        <w:rPr>
+          <w:rFonts w:ascii="Times New Roman" w:hAnsi="Times New Roman" w:cs="Times New Roman"/>
+        </w:rPr>
+        <w:t>on</w:t>
+      </w:r>
+      <w:proofErr w:type="gramEnd"/>
+    </w:p>
+    <w:p>
+      <w:pPr>
+        <w:rPr>
+          <w:rFonts w:ascii="Times New Roman" w:hAnsi="Times New Roman" w:cs="Times New Roman"/>
+        </w:rPr>
+      </w:pPr>
+      <w:proofErr w:type="gramStart"/>
+      <w:r>
+        <w:rPr>
+          <w:rFonts w:ascii="Times New Roman" w:hAnsi="Times New Roman" w:cs="Times New Roman"/>
+        </w:rPr>
+        <w:t xml:space="preserve">{{ </w:t>
+      </w:r>
+      <w:proofErr w:type="spellStart"/>
+      <w:r>
+        <w:rPr>
+          <w:rFonts w:ascii="Times New Roman" w:hAnsi="Times New Roman" w:cs="Times New Roman"/>
+        </w:rPr>
+        <w:t>notice</w:t>
+      </w:r>
+      <w:proofErr w:type="gramEnd"/>
+      <w:r>
+        <w:rPr>
+          <w:rFonts w:ascii="Times New Roman" w:hAnsi="Times New Roman" w:cs="Times New Roman"/>
+        </w:rPr>
+        <w:t>_of_assembly_received_date</w:t>
+      </w:r>
+      <w:proofErr w:type="spellEnd"/>
+      <w:r>
+        <w:rPr>
+          <w:rFonts w:ascii="Times New Roman" w:hAnsi="Times New Roman" w:cs="Times New Roman"/>
+        </w:rPr>
+        <w:t xml:space="preserve"> }}</w:t>
       </w:r>
       <w:r>
         <w:rPr>
@@ -839,11 +1131,33 @@
         </w:rPr>
         <w:t xml:space="preserve"> </w:t>
       </w:r>
-      <w:r>
-        <w:rPr>
-          <w:rFonts w:ascii="Times New Roman" w:hAnsi="Times New Roman" w:cs="Times New Roman"/>
-        </w:rPr>
-        <w:t>{{ users[0].name.full() }}</w:t>
+      <w:proofErr w:type="gramStart"/>
+      <w:r>
+        <w:rPr>
+          <w:rFonts w:ascii="Times New Roman" w:hAnsi="Times New Roman" w:cs="Times New Roman"/>
+        </w:rPr>
+        <w:t>{{ users</w:t>
+      </w:r>
+      <w:proofErr w:type="gramEnd"/>
+      <w:r>
+        <w:rPr>
+          <w:rFonts w:ascii="Times New Roman" w:hAnsi="Times New Roman" w:cs="Times New Roman"/>
+        </w:rPr>
+        <w:t>[0].</w:t>
+      </w:r>
+      <w:proofErr w:type="spellStart"/>
+      <w:r>
+        <w:rPr>
+          <w:rFonts w:ascii="Times New Roman" w:hAnsi="Times New Roman" w:cs="Times New Roman"/>
+        </w:rPr>
+        <w:t>name.full</w:t>
+      </w:r>
+      <w:proofErr w:type="spellEnd"/>
+      <w:r>
+        <w:rPr>
+          <w:rFonts w:ascii="Times New Roman" w:hAnsi="Times New Roman" w:cs="Times New Roman"/>
+        </w:rPr>
+        <w:t>() }}</w:t>
       </w:r>
       <w:r>
         <w:rPr>
@@ -910,7 +1224,22 @@
         <w:rPr>
           <w:rFonts w:ascii="Times New Roman" w:hAnsi="Times New Roman" w:cs="Times New Roman"/>
         </w:rPr>
-        <w:t>** Indicate your selection by putting an "X" in the fillable field. Select only one.</w:t>
+        <w:lastRenderedPageBreak/>
+        <w:t xml:space="preserve">** </w:t>
+      </w:r>
+      <w:proofErr w:type="gramStart"/>
+      <w:r>
+        <w:rPr>
+          <w:rFonts w:ascii="Times New Roman" w:hAnsi="Times New Roman" w:cs="Times New Roman"/>
+        </w:rPr>
+        <w:t>Indicate</w:t>
+      </w:r>
+      <w:proofErr w:type="gramEnd"/>
+      <w:r>
+        <w:rPr>
+          <w:rFonts w:ascii="Times New Roman" w:hAnsi="Times New Roman" w:cs="Times New Roman"/>
+        </w:rPr>
+        <w:t xml:space="preserve"> your selection by putting an "X" in the fillable field. Select only one.</w:t>
       </w:r>
     </w:p>
     <w:sectPr>

</xml_diff>